<commit_message>
doc updated with card logic
</commit_message>
<xml_diff>
--- a/docs/clarifying-questions.docx
+++ b/docs/clarifying-questions.docx
@@ -1147,7 +1147,7 @@
           <w:sz w:val="19"/>
           <w:color w:val="5D696F"/>
         </w:rPr>
-        <w:t xml:space="preserve">The card’s date menu is the fast path; the modal is the full path.</w:t>
+        <w:t xml:space="preserve">The card’s date menu is the fast path; the modal is the full path. Which one a card opens depends on whether that report has been run before.</w:t>
       </w:r>
     </w:p>
     <w:p>
@@ -1198,7 +1198,41 @@
           <w:sz w:val="17"/>
           <w:color w:val="5D696F"/>
         </w:rPr>
-        <w:t xml:space="preserve">Clicking a card opens “Choose new dates” — five preset chips plus “Generate New Report”, which hands off to the full modal.</w:t>
+        <w:t xml:space="preserve">Clicking a card for a </w:t>
+      </w:r>
+      <w:r>
+        <w:rPr>
+          <w:rFonts w:ascii="Roboto" w:hAnsi="Roboto"/>
+          <w:sz w:val="17"/>
+          <w:b/>
+          <w:color w:val="5D696F"/>
+        </w:rPr>
+        <w:t xml:space="preserve">previously run</w:t>
+      </w:r>
+      <w:r>
+        <w:rPr>
+          <w:rFonts w:ascii="Roboto" w:hAnsi="Roboto"/>
+          <w:sz w:val="17"/>
+          <w:color w:val="5D696F"/>
+        </w:rPr>
+        <w:t xml:space="preserve"> report opens “Choose new dates” — five preset chips plus “Generate New Report”, which hands off to the full modal. A card for a report that has </w:t>
+      </w:r>
+      <w:r>
+        <w:rPr>
+          <w:rFonts w:ascii="Roboto" w:hAnsi="Roboto"/>
+          <w:sz w:val="17"/>
+          <w:b/>
+          <w:color w:val="5D696F"/>
+        </w:rPr>
+        <w:t xml:space="preserve">never been run</w:t>
+      </w:r>
+      <w:r>
+        <w:rPr>
+          <w:rFonts w:ascii="Roboto" w:hAnsi="Roboto"/>
+          <w:sz w:val="17"/>
+          <w:color w:val="5D696F"/>
+        </w:rPr>
+        <w:t xml:space="preserve"> skips this menu and opens the generate modal directly.</w:t>
       </w:r>
     </w:p>
     <w:p>
@@ -1238,7 +1272,7 @@
           <w:sz w:val="20"/>
           <w:color w:val="307FE2"/>
         </w:rPr>
-        <w:t xml:space="preserve">BUILT —  Relative, computed at click time from today back N days (Year to date runs from Jan 1). Nothing is stored as a fixed June 1&amp;ndash;30 window; the range always slides forward.</w:t>
+        <w:t xml:space="preserve">BUILT —  Relative, computed at click time from today back N days (Year to date runs from Jan 1). Nothing is stored as a fixed June 1–30 window; the range always slides forward.</w:t>
       </w:r>
     </w:p>
     <w:p>
@@ -1368,7 +1402,41 @@
           <w:sz w:val="20"/>
           <w:color w:val="0A891B"/>
         </w:rPr>
-        <w:t xml:space="preserve">: it is the one field that should always be an explicit choice, and a chip supplies it. Stored per user, per report, alongside run history.</w:t>
+        <w:t xml:space="preserve">: it is the one field that should always be an explicit choice, and a chip supplies it. Stored per user, per report, alongside run history.  </w:t>
+      </w:r>
+      <w:r>
+        <w:rPr>
+          <w:rFonts w:ascii="Roboto" w:hAnsi="Roboto"/>
+          <w:sz w:val="20"/>
+          <w:b/>
+          <w:color w:val="0A891B"/>
+        </w:rPr>
+        <w:t xml:space="preserve">Consequence for the Dashboard card.</w:t>
+      </w:r>
+      <w:r>
+        <w:rPr>
+          <w:rFonts w:ascii="Roboto" w:hAnsi="Roboto"/>
+          <w:sz w:val="20"/>
+          <w:color w:val="0A891B"/>
+        </w:rPr>
+        <w:t xml:space="preserve"> A favorited report that has never been run has no saved parameters and no preset to re-run, so its card action (“Generate report”) opens the </w:t>
+      </w:r>
+      <w:r>
+        <w:rPr>
+          <w:rFonts w:ascii="Roboto" w:hAnsi="Roboto"/>
+          <w:sz w:val="20"/>
+          <w:b/>
+          <w:color w:val="0A891B"/>
+        </w:rPr>
+        <w:t xml:space="preserve">generate modal directly</w:t>
+      </w:r>
+      <w:r>
+        <w:rPr>
+          <w:rFonts w:ascii="Roboto" w:hAnsi="Roboto"/>
+          <w:sz w:val="20"/>
+          <w:color w:val="0A891B"/>
+        </w:rPr>
+        <w:t xml:space="preserve"> — the “Choose new dates” menu is skipped, because a date alone cannot produce a report on a first run. Once the report has been generated once, the card action becomes “Create report” and opens the date menu as designed.</w:t>
       </w:r>
     </w:p>
     <w:p>

</xml_diff>